<commit_message>
Harden the template builder and remove the OCI-01-55 leftovers
The leftover check now reads each paragraph with its runs joined and
fails on sample names, identity documents and act numbers even when Word
split them, on URLs, on placeholders glued to stray text, on invisible
text and on external relationships. The rebuilt template drops the stray
9 before {{totalElementos}}, the white 1pt 'nk de fotografias:' and two
orphan links to the institutional Google Sheet.
</commit_message>
<xml_diff>
--- a/templates/formats/OCI-01-55-v2.docx
+++ b/templates/formats/OCI-01-55-v2.docx
@@ -746,14 +746,14 @@
           <w:rFonts w:ascii="Metropolis" w:eastAsia="Metropolis" w:hAnsi="Metropolis" w:cs="Metropolis"/>
           <w:szCs w:val="24"/>
         </w:rPr>
-        <w:t>9</w:t>
-      </w:r>
-      <w:r>
-        <w:rPr>
-          <w:rFonts w:ascii="Metropolis" w:eastAsia="Metropolis" w:hAnsi="Metropolis" w:cs="Metropolis"/>
-          <w:szCs w:val="24"/>
-        </w:rPr>
-        <w:t xml:space="preserve">{{totalElementos}}</w:t>
+        <w:t>{{totalElementos}}</w:t>
+      </w:r>
+      <w:r>
+        <w:rPr>
+          <w:rFonts w:ascii="Metropolis" w:eastAsia="Metropolis" w:hAnsi="Metropolis" w:cs="Metropolis"/>
+          <w:szCs w:val="24"/>
+        </w:rPr>
+        <w:t xml:space="preserve"/>
       </w:r>
     </w:p>
     <w:p>
@@ -807,25 +807,7 @@
         <w:t xml:space="preserve"> </w:t>
       </w:r>
       <w:proofErr w:type="spellStart"/>
-      <w:r>
-        <w:rPr>
-          <w:rFonts w:ascii="Metropolis" w:eastAsia="Metropolis" w:hAnsi="Metropolis" w:cs="Metropolis"/>
-          <w:color w:val="FFFFFF" w:themeColor="background1"/>
-          <w:sz w:val="2"/>
-          <w:szCs w:val="24"/>
-        </w:rPr>
-        <w:t>nk</w:t>
-      </w:r>
       <w:proofErr w:type="spellEnd"/>
-      <w:r>
-        <w:rPr>
-          <w:rFonts w:ascii="Metropolis" w:eastAsia="Metropolis" w:hAnsi="Metropolis" w:cs="Metropolis"/>
-          <w:color w:val="FFFFFF" w:themeColor="background1"/>
-          <w:sz w:val="2"/>
-          <w:szCs w:val="24"/>
-        </w:rPr>
-        <w:t xml:space="preserve"> de fotografías:</w:t>
-      </w:r>
       <w:r>
         <w:rPr>
           <w:rFonts w:ascii="Metropolis" w:eastAsia="Metropolis" w:hAnsi="Metropolis" w:cs="Metropolis"/>

</xml_diff>

<commit_message>
WIP persons import and cost center heads
</commit_message>
<xml_diff>
--- a/templates/formats/OCI-01-55-v2.docx
+++ b/templates/formats/OCI-01-55-v2.docx
@@ -1088,14 +1088,14 @@
           <w:rFonts w:ascii="Metropolis" w:eastAsia="Metropolis" w:hAnsi="Metropolis" w:cs="Metropolis"/>
           <w:szCs w:val="24"/>
         </w:rPr>
-        <w:t xml:space="preserve">C.C </w:t>
-      </w:r>
-      <w:r>
-        <w:rPr>
-          <w:rFonts w:ascii="Metropolis" w:eastAsia="Metropolis" w:hAnsi="Metropolis" w:cs="Metropolis"/>
-          <w:szCs w:val="24"/>
-        </w:rPr>
-        <w:t xml:space="preserve">{{responsable.documento}}</w:t>
+        <w:t xml:space="preserve">{{responsable.tipoDocumento}} {{responsable.documento}}</w:t>
+      </w:r>
+      <w:r>
+        <w:rPr>
+          <w:rFonts w:ascii="Metropolis" w:eastAsia="Metropolis" w:hAnsi="Metropolis" w:cs="Metropolis"/>
+          <w:szCs w:val="24"/>
+        </w:rPr>
+        <w:t xml:space="preserve"/>
       </w:r>
       <w:r>
         <w:rPr>
@@ -1165,7 +1165,7 @@
           <w:rFonts w:ascii="Metropolis" w:eastAsia="Metropolis" w:hAnsi="Metropolis" w:cs="Metropolis"/>
           <w:szCs w:val="24"/>
         </w:rPr>
-        <w:t>C.C {{auditor.documento}}</w:t>
+        <w:t>{{auditor.tipoDocumento}} {{auditor.documento}}</w:t>
       </w:r>
     </w:p>
     <w:p>

</xml_diff>